<commit_message>
added README.md from vulhub
</commit_message>
<xml_diff>
--- a/docs/Федоров Лаб2.docx
+++ b/docs/Федоров Лаб2.docx
@@ -589,6 +589,7 @@
           <w:bCs w:val="0"/>
           <w:color w:val="auto"/>
           <w:kern w:val="2"/>
+          <w:sz w:val="24"/>
           <w:szCs w:val="24"/>
           <w:lang w:eastAsia="en-US"/>
           <w14:ligatures w14:val="standardContextual"/>
@@ -604,7 +605,6 @@
           <w:rFonts w:eastAsia="Times New Roman" w:cs="Times New Roman"/>
           <w:noProof/>
           <w:kern w:val="0"/>
-          <w:sz w:val="24"/>
           <w:lang w:eastAsia="ru-RU"/>
           <w14:ligatures w14:val="none"/>
         </w:rPr>
@@ -663,51 +663,43 @@
             </w:rPr>
             <w:fldChar w:fldCharType="separate"/>
           </w:r>
-          <w:hyperlink w:anchor="_Toc241419972" w:history="1">
+          <w:hyperlink w:anchor="_Toc241761435" w:history="1">
             <w:r>
               <w:rPr>
                 <w:rStyle w:val="a3"/>
                 <w:noProof/>
-                <w:lang w:val="en-US"/>
-              </w:rPr>
-              <w:t>Вы</w:t>
+              </w:rPr>
+              <w:t xml:space="preserve">Выбранное </w:t>
             </w:r>
             <w:r>
               <w:rPr>
                 <w:rStyle w:val="a3"/>
                 <w:noProof/>
-              </w:rPr>
-              <w:t xml:space="preserve">бранное </w:t>
+                <w:lang w:val="en-US"/>
+              </w:rPr>
+              <w:t>C</w:t>
             </w:r>
             <w:r>
               <w:rPr>
                 <w:rStyle w:val="a3"/>
                 <w:noProof/>
-                <w:lang w:val="en-US"/>
-              </w:rPr>
-              <w:t>C</w:t>
+              </w:rPr>
+              <w:t>V</w:t>
             </w:r>
             <w:r>
               <w:rPr>
                 <w:rStyle w:val="a3"/>
                 <w:noProof/>
-              </w:rPr>
-              <w:t>V</w:t>
+                <w:lang w:val="en-US"/>
+              </w:rPr>
+              <w:t>E</w:t>
             </w:r>
             <w:r>
               <w:rPr>
                 <w:rStyle w:val="a3"/>
                 <w:noProof/>
-                <w:lang w:val="en-US"/>
-              </w:rPr>
-              <w:t>E и</w:t>
-            </w:r>
-            <w:r>
-              <w:rPr>
-                <w:rStyle w:val="a3"/>
-                <w:noProof/>
-              </w:rPr>
-              <w:t xml:space="preserve"> ее описание</w:t>
+              </w:rPr>
+              <w:t xml:space="preserve"> и ее описание</w:t>
             </w:r>
             <w:r>
               <w:rPr>
@@ -728,7 +720,7 @@
                 <w:noProof/>
                 <w:webHidden/>
               </w:rPr>
-              <w:instrText xml:space="preserve"> PAGEREF _Toc241419972 \h </w:instrText>
+              <w:instrText xml:space="preserve"> PAGEREF _Toc241761435 \h </w:instrText>
             </w:r>
             <w:r>
               <w:rPr>
@@ -775,7 +767,7 @@
               <w:lang w:eastAsia="ru-RU"/>
             </w:rPr>
           </w:pPr>
-          <w:hyperlink w:anchor="_Toc241419973" w:history="1">
+          <w:hyperlink w:anchor="_Toc241761436" w:history="1">
             <w:r>
               <w:rPr>
                 <w:rStyle w:val="a3"/>
@@ -802,7 +794,7 @@
                 <w:noProof/>
                 <w:webHidden/>
               </w:rPr>
-              <w:instrText xml:space="preserve"> PAGEREF _Toc241419973 \h </w:instrText>
+              <w:instrText xml:space="preserve"> PAGEREF _Toc241761436 \h </w:instrText>
             </w:r>
             <w:r>
               <w:rPr>
@@ -849,7 +841,7 @@
               <w:lang w:eastAsia="ru-RU"/>
             </w:rPr>
           </w:pPr>
-          <w:hyperlink w:anchor="_Toc241419974" w:history="1">
+          <w:hyperlink w:anchor="_Toc241761437" w:history="1">
             <w:r>
               <w:rPr>
                 <w:rStyle w:val="a3"/>
@@ -879,7 +871,7 @@
                 <w:noProof/>
                 <w:webHidden/>
               </w:rPr>
-              <w:instrText xml:space="preserve"> PAGEREF _Toc241419974 \h </w:instrText>
+              <w:instrText xml:space="preserve"> PAGEREF _Toc241761437 \h </w:instrText>
             </w:r>
             <w:r>
               <w:rPr>
@@ -926,7 +918,7 @@
               <w:lang w:eastAsia="ru-RU"/>
             </w:rPr>
           </w:pPr>
-          <w:hyperlink w:anchor="_Toc241419975" w:history="1">
+          <w:hyperlink w:anchor="_Toc241761438" w:history="1">
             <w:r>
               <w:rPr>
                 <w:rStyle w:val="a3"/>
@@ -954,7 +946,7 @@
                 <w:noProof/>
                 <w:webHidden/>
               </w:rPr>
-              <w:instrText xml:space="preserve"> PAGEREF _Toc241419975 \h </w:instrText>
+              <w:instrText xml:space="preserve"> PAGEREF _Toc241761438 \h </w:instrText>
             </w:r>
             <w:r>
               <w:rPr>
@@ -1001,7 +993,7 @@
               <w:lang w:eastAsia="ru-RU"/>
             </w:rPr>
           </w:pPr>
-          <w:hyperlink w:anchor="_Toc241419976" w:history="1">
+          <w:hyperlink w:anchor="_Toc241761439" w:history="1">
             <w:r>
               <w:rPr>
                 <w:rStyle w:val="a3"/>
@@ -1028,7 +1020,7 @@
                 <w:noProof/>
                 <w:webHidden/>
               </w:rPr>
-              <w:instrText xml:space="preserve"> PAGEREF _Toc241419976 \h </w:instrText>
+              <w:instrText xml:space="preserve"> PAGEREF _Toc241761439 \h </w:instrText>
             </w:r>
             <w:r>
               <w:rPr>
@@ -1075,7 +1067,7 @@
               <w:lang w:eastAsia="ru-RU"/>
             </w:rPr>
           </w:pPr>
-          <w:hyperlink w:anchor="_Toc241419977" w:history="1">
+          <w:hyperlink w:anchor="_Toc241761440" w:history="1">
             <w:r>
               <w:rPr>
                 <w:rStyle w:val="a3"/>
@@ -1102,7 +1094,7 @@
                 <w:noProof/>
                 <w:webHidden/>
               </w:rPr>
-              <w:instrText xml:space="preserve"> PAGEREF _Toc241419977 \h </w:instrText>
+              <w:instrText xml:space="preserve"> PAGEREF _Toc241761440 \h </w:instrText>
             </w:r>
             <w:r>
               <w:rPr>
@@ -1149,7 +1141,7 @@
               <w:lang w:eastAsia="ru-RU"/>
             </w:rPr>
           </w:pPr>
-          <w:hyperlink w:anchor="_Toc241419978" w:history="1">
+          <w:hyperlink w:anchor="_Toc241761441" w:history="1">
             <w:r>
               <w:rPr>
                 <w:rStyle w:val="a3"/>
@@ -1184,7 +1176,7 @@
                 <w:noProof/>
                 <w:webHidden/>
               </w:rPr>
-              <w:instrText xml:space="preserve"> PAGEREF _Toc241419978 \h </w:instrText>
+              <w:instrText xml:space="preserve"> PAGEREF _Toc241761441 \h </w:instrText>
             </w:r>
             <w:r>
               <w:rPr>
@@ -1205,6 +1197,80 @@
                 <w:webHidden/>
               </w:rPr>
               <w:t>4</w:t>
+            </w:r>
+            <w:r>
+              <w:rPr>
+                <w:noProof/>
+                <w:webHidden/>
+              </w:rPr>
+              <w:fldChar w:fldCharType="end"/>
+            </w:r>
+          </w:hyperlink>
+        </w:p>
+        <w:p>
+          <w:pPr>
+            <w:pStyle w:val="11"/>
+            <w:tabs>
+              <w:tab w:val="right" w:leader="dot" w:pos="9344"/>
+            </w:tabs>
+            <w:rPr>
+              <w:rFonts w:eastAsiaTheme="minorEastAsia" w:cstheme="minorBidi"/>
+              <w:b w:val="0"/>
+              <w:bCs w:val="0"/>
+              <w:i w:val="0"/>
+              <w:iCs w:val="0"/>
+              <w:noProof/>
+              <w:lang w:eastAsia="ru-RU"/>
+            </w:rPr>
+          </w:pPr>
+          <w:hyperlink w:anchor="_Toc241761442" w:history="1">
+            <w:r>
+              <w:rPr>
+                <w:rStyle w:val="a3"/>
+                <w:noProof/>
+              </w:rPr>
+              <w:t>Проверка, что основная функциональность (в виде авторизации) не задета после исправлений</w:t>
+            </w:r>
+            <w:r>
+              <w:rPr>
+                <w:noProof/>
+                <w:webHidden/>
+              </w:rPr>
+              <w:tab/>
+            </w:r>
+            <w:r>
+              <w:rPr>
+                <w:noProof/>
+                <w:webHidden/>
+              </w:rPr>
+              <w:fldChar w:fldCharType="begin"/>
+            </w:r>
+            <w:r>
+              <w:rPr>
+                <w:noProof/>
+                <w:webHidden/>
+              </w:rPr>
+              <w:instrText xml:space="preserve"> PAGEREF _Toc241761442 \h </w:instrText>
+            </w:r>
+            <w:r>
+              <w:rPr>
+                <w:noProof/>
+                <w:webHidden/>
+              </w:rPr>
+            </w:r>
+            <w:r>
+              <w:rPr>
+                <w:noProof/>
+                <w:webHidden/>
+              </w:rPr>
+              <w:fldChar w:fldCharType="separate"/>
+            </w:r>
+            <w:r>
+              <w:rPr>
+                <w:noProof/>
+                <w:webHidden/>
+              </w:rPr>
+              <w:t>6</w:t>
             </w:r>
             <w:r>
               <w:rPr>
@@ -1237,53 +1303,103 @@
       <w:pPr>
         <w:pStyle w:val="1"/>
       </w:pPr>
-      <w:bookmarkStart w:id="0" w:name="_Toc241419972"/>
+      <w:bookmarkStart w:id="0" w:name="_Toc241761435"/>
+      <w:r>
+        <w:t>Вы</w:t>
+      </w:r>
+      <w:r>
+        <w:t xml:space="preserve">бранное </w:t>
+      </w:r>
+      <w:r>
+        <w:rPr>
+          <w:lang w:val="en-US"/>
+        </w:rPr>
+        <w:t>C</w:t>
+      </w:r>
+      <w:r>
+        <w:t>V</w:t>
+      </w:r>
+      <w:r>
+        <w:rPr>
+          <w:lang w:val="en-US"/>
+        </w:rPr>
+        <w:t>E</w:t>
+      </w:r>
+      <w:r>
+        <w:t xml:space="preserve"> и</w:t>
+      </w:r>
+      <w:r>
+        <w:t xml:space="preserve"> ее описание</w:t>
+      </w:r>
+      <w:bookmarkEnd w:id="0"/>
+    </w:p>
+    <w:p>
+      <w:pPr>
+        <w:rPr>
+          <w:color w:val="000000"/>
+          <w:sz w:val="28"/>
+          <w:szCs w:val="28"/>
+        </w:rPr>
+      </w:pPr>
+      <w:r>
+        <w:rPr>
+          <w:color w:val="000000"/>
+          <w:sz w:val="28"/>
+          <w:szCs w:val="28"/>
+        </w:rPr>
+        <w:t xml:space="preserve">CVE-2012-2122 </w:t>
+      </w:r>
+      <w:r>
+        <w:rPr>
+          <w:color w:val="000000"/>
+          <w:sz w:val="28"/>
+          <w:szCs w:val="28"/>
+        </w:rPr>
+        <w:t>-</w:t>
+      </w:r>
+      <w:r>
+        <w:rPr>
+          <w:color w:val="000000"/>
+          <w:sz w:val="28"/>
+          <w:szCs w:val="28"/>
+        </w:rPr>
+        <w:t xml:space="preserve"> обход аутентификации в СУБД MySQL / </w:t>
+      </w:r>
       <w:proofErr w:type="spellStart"/>
       <w:r>
         <w:rPr>
-          <w:lang w:val="en-US"/>
-        </w:rPr>
-        <w:t>Вы</w:t>
+          <w:color w:val="000000"/>
+          <w:sz w:val="28"/>
+          <w:szCs w:val="28"/>
+        </w:rPr>
+        <w:t>MariaDB</w:t>
       </w:r>
       <w:proofErr w:type="spellEnd"/>
       <w:r>
-        <w:t xml:space="preserve">бранное </w:t>
-      </w:r>
-      <w:r>
-        <w:rPr>
-          <w:lang w:val="en-US"/>
-        </w:rPr>
-        <w:t>C</w:t>
-      </w:r>
-      <w:r>
-        <w:t>V</w:t>
-      </w:r>
-      <w:r>
-        <w:rPr>
-          <w:lang w:val="en-US"/>
-        </w:rPr>
-        <w:t>E и</w:t>
-      </w:r>
-      <w:r>
-        <w:t xml:space="preserve"> ее описание</w:t>
-      </w:r>
-      <w:bookmarkEnd w:id="0"/>
-    </w:p>
-    <w:p>
-      <w:pPr>
         <w:rPr>
           <w:color w:val="000000"/>
           <w:sz w:val="28"/>
           <w:szCs w:val="28"/>
         </w:rPr>
-      </w:pPr>
+        <w:t xml:space="preserve"> (MySQL </w:t>
+      </w:r>
+      <w:proofErr w:type="spellStart"/>
       <w:r>
         <w:rPr>
           <w:color w:val="000000"/>
           <w:sz w:val="28"/>
           <w:szCs w:val="28"/>
         </w:rPr>
-        <w:t xml:space="preserve">CVE-2012-2122 — обход аутентификации в СУБД MySQL / </w:t>
+        <w:t>Authentication</w:t>
+      </w:r>
+      <w:proofErr w:type="spellEnd"/>
+      <w:r>
+        <w:rPr>
+          <w:color w:val="000000"/>
+          <w:sz w:val="28"/>
+          <w:szCs w:val="28"/>
+        </w:rPr>
+        <w:t xml:space="preserve"> </w:t>
       </w:r>
       <w:proofErr w:type="spellStart"/>
       <w:r>
@@ -1292,7 +1408,7 @@
           <w:sz w:val="28"/>
           <w:szCs w:val="28"/>
         </w:rPr>
-        <w:t>MariaDB</w:t>
+        <w:t>Bypass</w:t>
       </w:r>
       <w:proofErr w:type="spellEnd"/>
       <w:r>
@@ -1301,7 +1417,22 @@
           <w:sz w:val="28"/>
           <w:szCs w:val="28"/>
         </w:rPr>
-        <w:t xml:space="preserve"> (MySQL </w:t>
+        <w:t>).</w:t>
+      </w:r>
+      <w:r>
+        <w:rPr>
+          <w:color w:val="000000"/>
+          <w:szCs w:val="28"/>
+        </w:rPr>
+        <w:t xml:space="preserve"> </w:t>
+      </w:r>
+      <w:r>
+        <w:rPr>
+          <w:color w:val="000000"/>
+          <w:sz w:val="28"/>
+          <w:szCs w:val="28"/>
+        </w:rPr>
+        <w:t xml:space="preserve">Уязвимость позволяет удалённо войти под любым пользователем (в частности, </w:t>
       </w:r>
       <w:proofErr w:type="spellStart"/>
       <w:r>
@@ -1310,7 +1441,7 @@
           <w:sz w:val="28"/>
           <w:szCs w:val="28"/>
         </w:rPr>
-        <w:t>Authentication</w:t>
+        <w:t>root</w:t>
       </w:r>
       <w:proofErr w:type="spellEnd"/>
       <w:r>
@@ -1319,29 +1450,43 @@
           <w:sz w:val="28"/>
           <w:szCs w:val="28"/>
         </w:rPr>
+        <w:t>), не зная</w:t>
+      </w:r>
+      <w:r>
+        <w:rPr>
+          <w:color w:val="000000"/>
+          <w:szCs w:val="28"/>
+        </w:rPr>
         <w:t xml:space="preserve"> </w:t>
       </w:r>
-      <w:proofErr w:type="spellStart"/>
       <w:r>
         <w:rPr>
           <w:color w:val="000000"/>
           <w:sz w:val="28"/>
           <w:szCs w:val="28"/>
         </w:rPr>
-        <w:t>Bypass</w:t>
-      </w:r>
-      <w:proofErr w:type="spellEnd"/>
-      <w:r>
+        <w:t>пароля, достаточно многократно повторять попытки соединения с произвольным неверным</w:t>
+      </w:r>
+    </w:p>
+    <w:p>
+      <w:pPr>
         <w:rPr>
           <w:color w:val="000000"/>
           <w:sz w:val="28"/>
           <w:szCs w:val="28"/>
         </w:rPr>
-        <w:t>).</w:t>
-      </w:r>
+      </w:pPr>
       <w:r>
         <w:rPr>
           <w:color w:val="000000"/>
+          <w:sz w:val="28"/>
+          <w:szCs w:val="28"/>
+        </w:rPr>
+        <w:t>паролем: из-за дефекта в проверке криптографического токена часть попыток ошибочно признаётся</w:t>
+      </w:r>
+      <w:r>
+        <w:rPr>
+          <w:color w:val="000000"/>
           <w:szCs w:val="28"/>
         </w:rPr>
         <w:t xml:space="preserve"> </w:t>
@@ -1352,81 +1497,6 @@
           <w:sz w:val="28"/>
           <w:szCs w:val="28"/>
         </w:rPr>
-        <w:t xml:space="preserve">Уязвимость позволяет удалённо войти под любым пользователем (в частности, </w:t>
-      </w:r>
-      <w:proofErr w:type="spellStart"/>
-      <w:r>
-        <w:rPr>
-          <w:color w:val="000000"/>
-          <w:sz w:val="28"/>
-          <w:szCs w:val="28"/>
-        </w:rPr>
-        <w:t>root</w:t>
-      </w:r>
-      <w:proofErr w:type="spellEnd"/>
-      <w:r>
-        <w:rPr>
-          <w:color w:val="000000"/>
-          <w:sz w:val="28"/>
-          <w:szCs w:val="28"/>
-        </w:rPr>
-        <w:t>), не зная</w:t>
-      </w:r>
-      <w:r>
-        <w:rPr>
-          <w:color w:val="000000"/>
-          <w:szCs w:val="28"/>
-        </w:rPr>
-        <w:t xml:space="preserve"> </w:t>
-      </w:r>
-      <w:proofErr w:type="gramStart"/>
-      <w:r>
-        <w:rPr>
-          <w:color w:val="000000"/>
-          <w:sz w:val="28"/>
-          <w:szCs w:val="28"/>
-        </w:rPr>
-        <w:t>пароля,  достаточно</w:t>
-      </w:r>
-      <w:proofErr w:type="gramEnd"/>
-      <w:r>
-        <w:rPr>
-          <w:color w:val="000000"/>
-          <w:sz w:val="28"/>
-          <w:szCs w:val="28"/>
-        </w:rPr>
-        <w:t xml:space="preserve"> многократно повторять попытки соединения с произвольным неверным</w:t>
-      </w:r>
-    </w:p>
-    <w:p>
-      <w:pPr>
-        <w:rPr>
-          <w:color w:val="000000"/>
-          <w:sz w:val="28"/>
-          <w:szCs w:val="28"/>
-        </w:rPr>
-      </w:pPr>
-      <w:r>
-        <w:rPr>
-          <w:color w:val="000000"/>
-          <w:sz w:val="28"/>
-          <w:szCs w:val="28"/>
-        </w:rPr>
-        <w:t>паролем: из-за дефекта в проверке криптографического токена часть попыток ошибочно признаётся</w:t>
-      </w:r>
-      <w:r>
-        <w:rPr>
-          <w:color w:val="000000"/>
-          <w:szCs w:val="28"/>
-        </w:rPr>
-        <w:t xml:space="preserve"> </w:t>
-      </w:r>
-      <w:r>
-        <w:rPr>
-          <w:color w:val="000000"/>
-          <w:sz w:val="28"/>
-          <w:szCs w:val="28"/>
-        </w:rPr>
         <w:t>успешной.</w:t>
       </w:r>
     </w:p>
@@ -1435,7 +1505,7 @@
       <w:pPr>
         <w:pStyle w:val="1"/>
       </w:pPr>
-      <w:bookmarkStart w:id="1" w:name="_Toc241419973"/>
+      <w:bookmarkStart w:id="1" w:name="_Toc241761436"/>
       <w:r>
         <w:t>Запуск уязвимого окружения и воспроизведение атаки</w:t>
       </w:r>
@@ -1688,6 +1758,9 @@
         <w:jc w:val="center"/>
       </w:pPr>
       <w:r>
+        <w:rPr>
+          <w:noProof/>
+        </w:rPr>
         <w:drawing>
           <wp:inline distT="0" distB="0" distL="0" distR="0" wp14:anchorId="08790B09" wp14:editId="5D9E1FBB">
             <wp:extent cx="5939790" cy="1243330"/>
@@ -1928,6 +2001,7 @@
       </w:pPr>
       <w:r>
         <w:rPr>
+          <w:noProof/>
           <w:lang w:val="en-US"/>
         </w:rPr>
         <w:lastRenderedPageBreak/>
@@ -1986,7 +2060,7 @@
           <w:szCs w:val="23"/>
         </w:rPr>
       </w:pPr>
-      <w:bookmarkStart w:id="2" w:name="_Toc241419974"/>
+      <w:bookmarkStart w:id="2" w:name="_Toc241761437"/>
       <w:r>
         <w:rPr>
           <w:rStyle w:val="10"/>
@@ -2025,7 +2099,7 @@
           <w:szCs w:val="28"/>
         </w:rPr>
       </w:pPr>
-      <w:bookmarkStart w:id="3" w:name="_Toc241419975"/>
+      <w:bookmarkStart w:id="3" w:name="_Toc241761438"/>
       <w:r>
         <w:rPr>
           <w:rFonts w:cs="Times New Roman"/>
@@ -2155,16 +2229,29 @@
                 <w:sz w:val="28"/>
                 <w:szCs w:val="28"/>
               </w:rPr>
-              <w:t>случайное 20-байтовое число; сервер присылает</w:t>
-            </w:r>
-          </w:p>
-          <w:p>
-            <w:pPr>
+              <w:t>случайное 20-байтовое число; сервер</w:t>
+            </w:r>
+            <w:r>
               <w:rPr>
                 <w:sz w:val="28"/>
                 <w:szCs w:val="28"/>
               </w:rPr>
-            </w:pPr>
+              <w:t xml:space="preserve"> </w:t>
+            </w:r>
+            <w:r>
+              <w:rPr>
+                <w:sz w:val="28"/>
+                <w:szCs w:val="28"/>
+              </w:rPr>
+              <w:t>присылает</w:t>
+            </w:r>
+            <w:r>
+              <w:rPr>
+                <w:sz w:val="28"/>
+                <w:szCs w:val="28"/>
+              </w:rPr>
+              <w:t xml:space="preserve"> </w:t>
+            </w:r>
             <w:r>
               <w:rPr>
                 <w:sz w:val="28"/>
@@ -2214,14 +2301,13 @@
               </w:rPr>
               <w:t>число (20 байт), вычисляемое клиентом из</w:t>
             </w:r>
-          </w:p>
-          <w:p>
-            <w:pPr>
+            <w:r>
               <w:rPr>
                 <w:sz w:val="28"/>
                 <w:szCs w:val="28"/>
               </w:rPr>
-            </w:pPr>
+              <w:t xml:space="preserve"> </w:t>
+            </w:r>
             <w:r>
               <w:rPr>
                 <w:sz w:val="28"/>
@@ -2303,7 +2389,7 @@
       <w:pPr>
         <w:pStyle w:val="2"/>
       </w:pPr>
-      <w:bookmarkStart w:id="4" w:name="_Toc241419976"/>
+      <w:bookmarkStart w:id="4" w:name="_Toc241761439"/>
       <w:r>
         <w:t>Алгоритм входа:</w:t>
       </w:r>
@@ -2321,7 +2407,21 @@
           <w:sz w:val="28"/>
           <w:szCs w:val="28"/>
         </w:rPr>
-        <w:t xml:space="preserve">1. Клиент → сервер: запрос входа пользователем </w:t>
+        <w:t xml:space="preserve">1. Клиент </w:t>
+      </w:r>
+      <w:r>
+        <w:rPr>
+          <w:sz w:val="28"/>
+          <w:szCs w:val="28"/>
+        </w:rPr>
+        <w:t>-</w:t>
+      </w:r>
+      <w:r>
+        <w:rPr>
+          <w:sz w:val="28"/>
+          <w:szCs w:val="28"/>
+        </w:rPr>
+        <w:t xml:space="preserve"> сервер: запрос входа пользователем </w:t>
       </w:r>
       <w:proofErr w:type="spellStart"/>
       <w:r>
@@ -2352,7 +2452,35 @@
           <w:sz w:val="28"/>
           <w:szCs w:val="28"/>
         </w:rPr>
-        <w:t>2. Сервер → клиент: соль — случайное 20-байтовое число (новое каждый раз, поэтому перехваченный</w:t>
+        <w:t xml:space="preserve">2. Сервер </w:t>
+      </w:r>
+      <w:r>
+        <w:rPr>
+          <w:sz w:val="28"/>
+          <w:szCs w:val="28"/>
+        </w:rPr>
+        <w:t>-</w:t>
+      </w:r>
+      <w:r>
+        <w:rPr>
+          <w:sz w:val="28"/>
+          <w:szCs w:val="28"/>
+        </w:rPr>
+        <w:t xml:space="preserve"> клиент: соль </w:t>
+      </w:r>
+      <w:r>
+        <w:rPr>
+          <w:sz w:val="28"/>
+          <w:szCs w:val="28"/>
+        </w:rPr>
+        <w:t>-</w:t>
+      </w:r>
+      <w:r>
+        <w:rPr>
+          <w:sz w:val="28"/>
+          <w:szCs w:val="28"/>
+        </w:rPr>
+        <w:t xml:space="preserve"> случайное 20-байтовое число (новое каждый раз,</w:t>
       </w:r>
       <w:r>
         <w:rPr>
@@ -2366,6 +2494,20 @@
           <w:sz w:val="28"/>
           <w:szCs w:val="28"/>
         </w:rPr>
+        <w:t>поэтому перехваченный</w:t>
+      </w:r>
+      <w:r>
+        <w:rPr>
+          <w:sz w:val="28"/>
+          <w:szCs w:val="28"/>
+        </w:rPr>
+        <w:t xml:space="preserve"> </w:t>
+      </w:r>
+      <w:r>
+        <w:rPr>
+          <w:sz w:val="28"/>
+          <w:szCs w:val="28"/>
+        </w:rPr>
         <w:t>ранее токен повторно не примут).</w:t>
       </w:r>
     </w:p>
@@ -2412,7 +2554,21 @@
           <w:sz w:val="28"/>
           <w:szCs w:val="28"/>
         </w:rPr>
-        <w:t>4. Сервер: по хранимому отпечатку пароля и той же соли вычисляет ожидаемый токен.</w:t>
+        <w:t>4. Сервер: по хранимому отпечатку пароля и той же соли вычисляет</w:t>
+      </w:r>
+      <w:r>
+        <w:rPr>
+          <w:sz w:val="28"/>
+          <w:szCs w:val="28"/>
+        </w:rPr>
+        <w:t xml:space="preserve"> </w:t>
+      </w:r>
+      <w:r>
+        <w:rPr>
+          <w:sz w:val="28"/>
+          <w:szCs w:val="28"/>
+        </w:rPr>
+        <w:t>ожидаемый токен.</w:t>
       </w:r>
     </w:p>
     <w:p>
@@ -2450,7 +2606,35 @@
           <w:sz w:val="28"/>
           <w:szCs w:val="28"/>
         </w:rPr>
-        <w:t xml:space="preserve">равны — вход разрешён, иначе — «Access </w:t>
+        <w:t xml:space="preserve">равны </w:t>
+      </w:r>
+      <w:r>
+        <w:rPr>
+          <w:sz w:val="28"/>
+          <w:szCs w:val="28"/>
+        </w:rPr>
+        <w:t xml:space="preserve">- </w:t>
+      </w:r>
+      <w:r>
+        <w:rPr>
+          <w:sz w:val="28"/>
+          <w:szCs w:val="28"/>
+        </w:rPr>
+        <w:t xml:space="preserve">вход разрешён, иначе </w:t>
+      </w:r>
+      <w:r>
+        <w:rPr>
+          <w:sz w:val="28"/>
+          <w:szCs w:val="28"/>
+        </w:rPr>
+        <w:t>-</w:t>
+      </w:r>
+      <w:r>
+        <w:rPr>
+          <w:sz w:val="28"/>
+          <w:szCs w:val="28"/>
+        </w:rPr>
+        <w:t xml:space="preserve"> «Access </w:t>
       </w:r>
       <w:proofErr w:type="spellStart"/>
       <w:r>
@@ -2481,39 +2665,81 @@
           <w:sz w:val="28"/>
           <w:szCs w:val="28"/>
         </w:rPr>
+        <w:t xml:space="preserve">Сравнение выполняет </w:t>
+      </w:r>
+      <w:proofErr w:type="spellStart"/>
+      <w:r>
+        <w:rPr>
+          <w:rFonts w:ascii="Courier New" w:hAnsi="Courier New" w:cs="Courier New"/>
+          <w:sz w:val="28"/>
+          <w:szCs w:val="28"/>
+        </w:rPr>
+        <w:t>memcmp</w:t>
+      </w:r>
+      <w:proofErr w:type="spellEnd"/>
+      <w:r>
+        <w:rPr>
+          <w:sz w:val="28"/>
+          <w:szCs w:val="28"/>
+        </w:rPr>
+        <w:t xml:space="preserve"> </w:t>
+      </w:r>
+      <w:r>
+        <w:rPr>
+          <w:sz w:val="28"/>
+          <w:szCs w:val="28"/>
+        </w:rPr>
+        <w:t>-</w:t>
+      </w:r>
+      <w:r>
+        <w:rPr>
+          <w:sz w:val="28"/>
+          <w:szCs w:val="28"/>
+        </w:rPr>
+        <w:t xml:space="preserve"> стандартная функция C «сравнить две области памяти байт в</w:t>
+      </w:r>
+      <w:r>
+        <w:rPr>
+          <w:sz w:val="28"/>
+          <w:szCs w:val="28"/>
+        </w:rPr>
+        <w:t xml:space="preserve"> </w:t>
+      </w:r>
+      <w:r>
+        <w:rPr>
+          <w:sz w:val="28"/>
+          <w:szCs w:val="28"/>
+        </w:rPr>
+        <w:t xml:space="preserve">байт». Договорённость: 0 </w:t>
+      </w:r>
+      <w:r>
+        <w:rPr>
+          <w:sz w:val="28"/>
+          <w:szCs w:val="28"/>
+        </w:rPr>
+        <w:t>-</w:t>
+      </w:r>
+      <w:r>
+        <w:rPr>
+          <w:sz w:val="28"/>
+          <w:szCs w:val="28"/>
+        </w:rPr>
+        <w:t xml:space="preserve"> данные равны, не ноль </w:t>
+      </w:r>
+      <w:r>
+        <w:rPr>
+          <w:sz w:val="28"/>
+          <w:szCs w:val="28"/>
+        </w:rPr>
+        <w:t>-</w:t>
+      </w:r>
+      <w:r>
+        <w:rPr>
+          <w:sz w:val="28"/>
+          <w:szCs w:val="28"/>
+        </w:rPr>
         <w:lastRenderedPageBreak/>
-        <w:t xml:space="preserve">Сравнение выполняет </w:t>
-      </w:r>
-      <w:proofErr w:type="spellStart"/>
-      <w:r>
-        <w:rPr>
-          <w:rFonts w:ascii="Courier New" w:hAnsi="Courier New" w:cs="Courier New"/>
-          <w:sz w:val="28"/>
-          <w:szCs w:val="28"/>
-        </w:rPr>
-        <w:t>memcmp</w:t>
-      </w:r>
-      <w:proofErr w:type="spellEnd"/>
-      <w:r>
-        <w:rPr>
-          <w:sz w:val="28"/>
-          <w:szCs w:val="28"/>
-        </w:rPr>
-        <w:t xml:space="preserve"> — стандартная функция C «сравнить две области памяти байт в</w:t>
-      </w:r>
-      <w:r>
-        <w:rPr>
-          <w:sz w:val="28"/>
-          <w:szCs w:val="28"/>
-        </w:rPr>
-        <w:t xml:space="preserve"> </w:t>
-      </w:r>
-      <w:r>
-        <w:rPr>
-          <w:sz w:val="28"/>
-          <w:szCs w:val="28"/>
-        </w:rPr>
-        <w:t xml:space="preserve">байт». Договорённость: 0 — данные равны, не ноль — различаются; какое именно «не ноль» </w:t>
+        <w:t xml:space="preserve">различаются; какое именно «не ноль» </w:t>
       </w:r>
       <w:r>
         <w:rPr>
@@ -2557,7 +2783,21 @@
           <w:sz w:val="28"/>
           <w:szCs w:val="28"/>
         </w:rPr>
-        <w:t xml:space="preserve">Дефект — в возврате результата этой функции из </w:t>
+        <w:t xml:space="preserve">Дефект </w:t>
+      </w:r>
+      <w:r>
+        <w:rPr>
+          <w:sz w:val="28"/>
+          <w:szCs w:val="28"/>
+        </w:rPr>
+        <w:t>-</w:t>
+      </w:r>
+      <w:r>
+        <w:rPr>
+          <w:sz w:val="28"/>
+          <w:szCs w:val="28"/>
+        </w:rPr>
+        <w:t xml:space="preserve"> в возврате результата этой функции из </w:t>
       </w:r>
       <w:proofErr w:type="spellStart"/>
       <w:r>
@@ -2686,15 +2926,16 @@
                 <w:szCs w:val="28"/>
                 <w:lang w:val="en-US"/>
               </w:rPr>
-              <w:t xml:space="preserve">/* 1 </w:t>
+              <w:t>/</w:t>
             </w:r>
             <w:r>
               <w:rPr>
                 <w:color w:val="616069"/>
                 <w:sz w:val="28"/>
                 <w:szCs w:val="28"/>
-              </w:rPr>
-              <w:t>байт</w:t>
+                <w:lang w:val="en-US"/>
+              </w:rPr>
+              <w:t>/</w:t>
             </w:r>
             <w:r>
               <w:rPr>
@@ -2703,7 +2944,15 @@
                 <w:szCs w:val="28"/>
                 <w:lang w:val="en-US"/>
               </w:rPr>
-              <w:t xml:space="preserve"> */</w:t>
+              <w:t xml:space="preserve"> 1 </w:t>
+            </w:r>
+            <w:r>
+              <w:rPr>
+                <w:color w:val="616069"/>
+                <w:sz w:val="28"/>
+                <w:szCs w:val="28"/>
+              </w:rPr>
+              <w:t>байт</w:t>
             </w:r>
           </w:p>
           <w:p>
@@ -2785,15 +3034,16 @@
                 <w:szCs w:val="28"/>
                 <w:lang w:val="en-US"/>
               </w:rPr>
-              <w:t xml:space="preserve">/* int (4 </w:t>
+              <w:t>/</w:t>
             </w:r>
             <w:r>
               <w:rPr>
                 <w:color w:val="616069"/>
                 <w:sz w:val="28"/>
                 <w:szCs w:val="28"/>
-              </w:rPr>
-              <w:t>байта</w:t>
+                <w:lang w:val="en-US"/>
+              </w:rPr>
+              <w:t>/</w:t>
             </w:r>
             <w:r>
               <w:rPr>
@@ -2802,7 +3052,7 @@
                 <w:szCs w:val="28"/>
                 <w:lang w:val="en-US"/>
               </w:rPr>
-              <w:t xml:space="preserve">) -&gt; char (1 </w:t>
+              <w:t xml:space="preserve"> int (4 </w:t>
             </w:r>
             <w:r>
               <w:rPr>
@@ -2810,7 +3060,7 @@
                 <w:sz w:val="28"/>
                 <w:szCs w:val="28"/>
               </w:rPr>
-              <w:t>байт</w:t>
+              <w:t>байта</w:t>
             </w:r>
             <w:r>
               <w:rPr>
@@ -2819,7 +3069,24 @@
                 <w:szCs w:val="28"/>
                 <w:lang w:val="en-US"/>
               </w:rPr>
-              <w:t>) */</w:t>
+              <w:t xml:space="preserve">) -&gt; char (1 </w:t>
+            </w:r>
+            <w:r>
+              <w:rPr>
+                <w:color w:val="616069"/>
+                <w:sz w:val="28"/>
+                <w:szCs w:val="28"/>
+              </w:rPr>
+              <w:t>байт</w:t>
+            </w:r>
+            <w:r>
+              <w:rPr>
+                <w:color w:val="616069"/>
+                <w:sz w:val="28"/>
+                <w:szCs w:val="28"/>
+                <w:lang w:val="en-US"/>
+              </w:rPr>
+              <w:t xml:space="preserve">) </w:t>
             </w:r>
           </w:p>
         </w:tc>
@@ -2844,7 +3111,7 @@
           <w:sz w:val="28"/>
           <w:szCs w:val="28"/>
         </w:rPr>
-        <w:t>–</w:t>
+        <w:t>-</w:t>
       </w:r>
       <w:r>
         <w:rPr>
@@ -2917,7 +3184,21 @@
           <w:sz w:val="28"/>
           <w:szCs w:val="28"/>
         </w:rPr>
-        <w:t xml:space="preserve">1. токены различаются → </w:t>
+        <w:t xml:space="preserve">1. токены различаются </w:t>
+      </w:r>
+      <w:r>
+        <w:rPr>
+          <w:sz w:val="28"/>
+          <w:szCs w:val="28"/>
+        </w:rPr>
+        <w:t>-</w:t>
+      </w:r>
+      <w:r>
+        <w:rPr>
+          <w:sz w:val="28"/>
+          <w:szCs w:val="28"/>
+        </w:rPr>
+        <w:t xml:space="preserve"> </w:t>
       </w:r>
       <w:proofErr w:type="spellStart"/>
       <w:r>
@@ -2964,7 +3245,22 @@
           <w:sz w:val="28"/>
           <w:szCs w:val="28"/>
         </w:rPr>
-        <w:t xml:space="preserve"> → </w:t>
+        <w:t xml:space="preserve"> </w:t>
+      </w:r>
+      <w:r>
+        <w:rPr>
+          <w:sz w:val="28"/>
+          <w:szCs w:val="28"/>
+          <w:lang w:val="en-US"/>
+        </w:rPr>
+        <w:t>-</w:t>
+      </w:r>
+      <w:r>
+        <w:rPr>
+          <w:sz w:val="28"/>
+          <w:szCs w:val="28"/>
+        </w:rPr>
+        <w:t xml:space="preserve"> </w:t>
       </w:r>
       <w:proofErr w:type="spellStart"/>
       <w:r>
@@ -2980,7 +3276,21 @@
           <w:sz w:val="28"/>
           <w:szCs w:val="28"/>
         </w:rPr>
-        <w:t>: 256 → 0;</w:t>
+        <w:t xml:space="preserve">: 256 </w:t>
+      </w:r>
+      <w:r>
+        <w:rPr>
+          <w:sz w:val="28"/>
+          <w:szCs w:val="28"/>
+        </w:rPr>
+        <w:t>-</w:t>
+      </w:r>
+      <w:r>
+        <w:rPr>
+          <w:sz w:val="28"/>
+          <w:szCs w:val="28"/>
+        </w:rPr>
+        <w:t xml:space="preserve"> 0;</w:t>
       </w:r>
     </w:p>
     <w:p>
@@ -3027,31 +3337,58 @@
           <w:sz w:val="28"/>
           <w:szCs w:val="28"/>
         </w:rPr>
-        <w:t>) означает «токены равны» → вход разрешён с неверным паролем.</w:t>
-      </w:r>
-    </w:p>
-    <w:p>
-      <w:pPr>
-        <w:rPr>
-          <w:sz w:val="28"/>
-          <w:szCs w:val="28"/>
-        </w:rPr>
-      </w:pPr>
-      <w:r>
-        <w:rPr>
-          <w:sz w:val="28"/>
-          <w:szCs w:val="28"/>
-        </w:rPr>
-        <w:t>Разница кратна 256 примерно в одной попытке из 256 — с той же частотой сравнение лжёт,</w:t>
-      </w:r>
-    </w:p>
-    <w:p>
-      <w:pPr>
-        <w:rPr>
-          <w:sz w:val="28"/>
-          <w:szCs w:val="28"/>
-        </w:rPr>
-      </w:pPr>
+        <w:t xml:space="preserve">) означает «токены равны» </w:t>
+      </w:r>
+      <w:r>
+        <w:rPr>
+          <w:sz w:val="28"/>
+          <w:szCs w:val="28"/>
+        </w:rPr>
+        <w:t>-</w:t>
+      </w:r>
+      <w:r>
+        <w:rPr>
+          <w:sz w:val="28"/>
+          <w:szCs w:val="28"/>
+        </w:rPr>
+        <w:t xml:space="preserve"> вход разрешён с неверным паролем.</w:t>
+      </w:r>
+    </w:p>
+    <w:p>
+      <w:pPr>
+        <w:rPr>
+          <w:sz w:val="28"/>
+          <w:szCs w:val="28"/>
+        </w:rPr>
+      </w:pPr>
+      <w:r>
+        <w:rPr>
+          <w:sz w:val="28"/>
+          <w:szCs w:val="28"/>
+        </w:rPr>
+        <w:t xml:space="preserve">Разница кратна 256 примерно в одной попытке из 256 </w:t>
+      </w:r>
+      <w:r>
+        <w:rPr>
+          <w:sz w:val="28"/>
+          <w:szCs w:val="28"/>
+        </w:rPr>
+        <w:t>-</w:t>
+      </w:r>
+      <w:r>
+        <w:rPr>
+          <w:sz w:val="28"/>
+          <w:szCs w:val="28"/>
+        </w:rPr>
+        <w:t xml:space="preserve"> с той же частотой сравнение лжёт,</w:t>
+      </w:r>
+      <w:r>
+        <w:rPr>
+          <w:sz w:val="28"/>
+          <w:szCs w:val="28"/>
+        </w:rPr>
+        <w:t xml:space="preserve"> </w:t>
+      </w:r>
       <w:r>
         <w:rPr>
           <w:sz w:val="28"/>
@@ -3117,7 +3454,7 @@
       <w:pPr>
         <w:pStyle w:val="1"/>
       </w:pPr>
-      <w:bookmarkStart w:id="5" w:name="_Toc241419977"/>
+      <w:bookmarkStart w:id="5" w:name="_Toc241761440"/>
       <w:r>
         <w:t>Описание примененного исправления</w:t>
       </w:r>
@@ -3127,10 +3464,10 @@
       <w:pPr>
         <w:pStyle w:val="2"/>
         <w:rPr>
-          <w:lang w:val="en-US" w:eastAsia="en-US"/>
-        </w:rPr>
-      </w:pPr>
-      <w:bookmarkStart w:id="6" w:name="_Toc241419978"/>
+          <w:lang w:eastAsia="en-US"/>
+        </w:rPr>
+      </w:pPr>
+      <w:bookmarkStart w:id="6" w:name="_Toc241761441"/>
       <w:r>
         <w:rPr>
           <w:lang w:eastAsia="en-US"/>
@@ -3547,6 +3884,7 @@
       </w:pPr>
       <w:r>
         <w:rPr>
+          <w:noProof/>
           <w:lang w:val="en-US" w:eastAsia="en-US"/>
         </w:rPr>
         <w:drawing>
@@ -3595,14 +3933,7 @@
         </w:numPr>
       </w:pPr>
       <w:r>
-        <w:lastRenderedPageBreak/>
-        <w:t>Проверка р</w:t>
-      </w:r>
-      <w:r>
-        <w:t>аботоспособност</w:t>
-      </w:r>
-      <w:r>
-        <w:t xml:space="preserve">и исправления: </w:t>
+        <w:t xml:space="preserve">Проверка работоспособности исправления: </w:t>
       </w:r>
     </w:p>
     <w:p>
@@ -3800,6 +4131,7 @@
         </w:numPr>
       </w:pPr>
       <w:r>
+        <w:lastRenderedPageBreak/>
         <w:t xml:space="preserve">Вывод после запуска скрипта: </w:t>
       </w:r>
     </w:p>
@@ -3811,6 +4143,7 @@
       </w:pPr>
       <w:r>
         <w:rPr>
+          <w:noProof/>
           <w:lang w:eastAsia="en-US"/>
         </w:rPr>
         <w:drawing>
@@ -4064,11 +4397,25 @@
                 <w:color w:val="616069"/>
                 <w:lang w:val="en-US"/>
               </w:rPr>
-              <w:t xml:space="preserve">/* </w:t>
+              <w:t>/</w:t>
             </w:r>
             <w:r>
               <w:rPr>
                 <w:color w:val="616069"/>
+                <w:lang w:val="en-US"/>
+              </w:rPr>
+              <w:t>/</w:t>
+            </w:r>
+            <w:r>
+              <w:rPr>
+                <w:color w:val="616069"/>
+                <w:lang w:val="en-US"/>
+              </w:rPr>
+              <w:t xml:space="preserve"> </w:t>
+            </w:r>
+            <w:r>
+              <w:rPr>
+                <w:color w:val="616069"/>
               </w:rPr>
               <w:t>результат</w:t>
             </w:r>
@@ -4077,11 +4424,25 @@
                 <w:color w:val="616069"/>
                 <w:lang w:val="en-US"/>
               </w:rPr>
-              <w:t xml:space="preserve"> — </w:t>
+              <w:t xml:space="preserve"> </w:t>
             </w:r>
             <w:r>
               <w:rPr>
                 <w:color w:val="616069"/>
+                <w:lang w:val="en-US"/>
+              </w:rPr>
+              <w:t>-</w:t>
+            </w:r>
+            <w:r>
+              <w:rPr>
+                <w:color w:val="616069"/>
+                <w:lang w:val="en-US"/>
+              </w:rPr>
+              <w:t xml:space="preserve"> </w:t>
+            </w:r>
+            <w:r>
+              <w:rPr>
+                <w:color w:val="616069"/>
               </w:rPr>
               <w:t>строго</w:t>
             </w:r>
@@ -4103,7 +4464,7 @@
                 <w:color w:val="616069"/>
                 <w:lang w:val="en-US"/>
               </w:rPr>
-              <w:t xml:space="preserve"> 1 */</w:t>
+              <w:t xml:space="preserve"> 1 </w:t>
             </w:r>
           </w:p>
         </w:tc>
@@ -4133,23 +4494,38 @@
           <w:sz w:val="28"/>
           <w:szCs w:val="28"/>
         </w:rPr>
-        <w:t>Выражение == 0 даёт только 0 или 1 — числа, которые в один байт помещаются целиком, поэтому</w:t>
-      </w:r>
-    </w:p>
-    <w:p>
-      <w:pPr>
+        <w:t xml:space="preserve">Выражение == 0 даёт только 0 или 1 </w:t>
+      </w:r>
+      <w:r>
         <w:rPr>
           <w:color w:val="000000"/>
           <w:sz w:val="28"/>
           <w:szCs w:val="28"/>
         </w:rPr>
-      </w:pPr>
+        <w:t>-</w:t>
+      </w:r>
       <w:r>
         <w:rPr>
           <w:color w:val="000000"/>
           <w:sz w:val="28"/>
           <w:szCs w:val="28"/>
         </w:rPr>
+        <w:t xml:space="preserve"> числа, которые в один байт помещаются целиком, поэтому</w:t>
+      </w:r>
+      <w:r>
+        <w:rPr>
+          <w:color w:val="000000"/>
+          <w:sz w:val="28"/>
+          <w:szCs w:val="28"/>
+        </w:rPr>
+        <w:t xml:space="preserve"> </w:t>
+      </w:r>
+      <w:r>
+        <w:rPr>
+          <w:color w:val="000000"/>
+          <w:sz w:val="28"/>
+          <w:szCs w:val="28"/>
+        </w:rPr>
         <w:t xml:space="preserve">последующее преобразование ничего исказить не может, ни при какой реализации </w:t>
       </w:r>
       <w:proofErr w:type="spellStart"/>
@@ -4177,6 +4553,99 @@
           <w:lang w:eastAsia="en-US"/>
         </w:rPr>
       </w:pPr>
+    </w:p>
+    <w:p>
+      <w:pPr>
+        <w:pStyle w:val="1"/>
+      </w:pPr>
+    </w:p>
+    <w:p>
+      <w:pPr>
+        <w:rPr>
+          <w:lang w:eastAsia="en-US"/>
+        </w:rPr>
+      </w:pPr>
+    </w:p>
+    <w:p>
+      <w:pPr>
+        <w:pStyle w:val="1"/>
+      </w:pPr>
+    </w:p>
+    <w:p>
+      <w:pPr>
+        <w:pStyle w:val="1"/>
+      </w:pPr>
+      <w:bookmarkStart w:id="7" w:name="_Toc241761442"/>
+      <w:r>
+        <w:t>Проверка, что основная функциональность (в виде авторизации) не задета после исправлений</w:t>
+      </w:r>
+      <w:bookmarkEnd w:id="7"/>
+    </w:p>
+    <w:p>
+      <w:pPr>
+        <w:rPr>
+          <w:lang w:eastAsia="en-US"/>
+        </w:rPr>
+      </w:pPr>
+      <w:r>
+        <w:rPr>
+          <w:lang w:eastAsia="en-US"/>
+        </w:rPr>
+        <w:t>Попробуем зайти в аккаунт с правильным паролем</w:t>
+      </w:r>
+      <w:r>
+        <w:rPr>
+          <w:lang w:eastAsia="en-US"/>
+        </w:rPr>
+        <w:t xml:space="preserve">, используя «исправленный» образ базы данных: </w:t>
+      </w:r>
+    </w:p>
+    <w:p>
+      <w:pPr>
+        <w:rPr>
+          <w:lang w:val="en-US" w:eastAsia="en-US"/>
+        </w:rPr>
+      </w:pPr>
+      <w:r>
+        <w:rPr>
+          <w:lang w:val="en-US" w:eastAsia="en-US"/>
+        </w:rPr>
+        <w:drawing>
+          <wp:inline distT="0" distB="0" distL="0" distR="0" wp14:anchorId="7EC89183" wp14:editId="616EEE8D">
+            <wp:extent cx="5939790" cy="2784475"/>
+            <wp:effectExtent l="0" t="0" r="3810" b="0"/>
+            <wp:docPr id="2121346469" name="Рисунок 1"/>
+            <wp:cNvGraphicFramePr>
+              <a:graphicFrameLocks xmlns:a="http://schemas.openxmlformats.org/drawingml/2006/main" noChangeAspect="1"/>
+            </wp:cNvGraphicFramePr>
+            <a:graphic xmlns:a="http://schemas.openxmlformats.org/drawingml/2006/main">
+              <a:graphicData uri="http://schemas.openxmlformats.org/drawingml/2006/picture">
+                <pic:pic xmlns:pic="http://schemas.openxmlformats.org/drawingml/2006/picture">
+                  <pic:nvPicPr>
+                    <pic:cNvPr id="2121346469" name=""/>
+                    <pic:cNvPicPr/>
+                  </pic:nvPicPr>
+                  <pic:blipFill>
+                    <a:blip r:embed="rId10"/>
+                    <a:stretch>
+                      <a:fillRect/>
+                    </a:stretch>
+                  </pic:blipFill>
+                  <pic:spPr>
+                    <a:xfrm>
+                      <a:off x="0" y="0"/>
+                      <a:ext cx="5939790" cy="2784475"/>
+                    </a:xfrm>
+                    <a:prstGeom prst="rect">
+                      <a:avLst/>
+                    </a:prstGeom>
+                  </pic:spPr>
+                </pic:pic>
+              </a:graphicData>
+            </a:graphic>
+          </wp:inline>
+        </w:drawing>
+      </w:r>
     </w:p>
     <w:sectPr>
       <w:pgSz w:w="11906" w:h="16838"/>
@@ -5682,6 +6151,16 @@
       <w14:ligatures w14:val="none"/>
     </w:rPr>
   </w:style>
+  <w:style w:type="character" w:styleId="a8">
+    <w:name w:val="Placeholder Text"/>
+    <w:basedOn w:val="a0"/>
+    <w:uiPriority w:val="99"/>
+    <w:semiHidden/>
+    <w:rsid w:val="0024340F"/>
+    <w:rPr>
+      <w:color w:val="666666"/>
+    </w:rPr>
+  </w:style>
 </w:styles>
 </file>
 

</xml_diff>

<commit_message>
added link to github in report
</commit_message>
<xml_diff>
--- a/docs/Федоров Лаб2.docx
+++ b/docs/Федоров Лаб2.docx
@@ -1,6 +1,6 @@
 
 <file path=word/document.xml><?xml version="1.0" encoding="utf-8"?>
-<w:document xmlns:wpc="http://schemas.microsoft.com/office/word/2010/wordprocessingCanvas" xmlns:cx="http://schemas.microsoft.com/office/drawing/2014/chartex" xmlns:cx1="http://schemas.microsoft.com/office/drawing/2015/9/8/chartex" xmlns:cx2="http://schemas.microsoft.com/office/drawing/2015/10/21/chartex" xmlns:cx3="http://schemas.microsoft.com/office/drawing/2016/5/9/chartex" xmlns:cx4="http://schemas.microsoft.com/office/drawing/2016/5/10/chartex" xmlns:cx5="http://schemas.microsoft.com/office/drawing/2016/5/11/chartex" xmlns:cx6="http://schemas.microsoft.com/office/drawing/2016/5/12/chartex" xmlns:cx7="http://schemas.microsoft.com/office/drawing/2016/5/13/chartex" xmlns:cx8="http://schemas.microsoft.com/office/drawing/2016/5/14/chartex" xmlns:mc="http://schemas.openxmlformats.org/markup-compatibility/2006" xmlns:aink="http://schemas.microsoft.com/office/drawing/2016/ink" xmlns:am3d="http://schemas.microsoft.com/office/drawing/2017/model3d" xmlns:o="urn:schemas-microsoft-com:office:office" xmlns:oel="http://schemas.microsoft.com/office/2019/extlst" xmlns:r="http://schemas.openxmlformats.org/officeDocument/2006/relationships" xmlns:m="http://schemas.openxmlformats.org/officeDocument/2006/math" xmlns:v="urn:schemas-microsoft-com:vml" xmlns:wp14="http://schemas.microsoft.com/office/word/2010/wordprocessingDrawing" xmlns:wp="http://schemas.openxmlformats.org/drawingml/2006/wordprocessingDrawing" xmlns:w10="urn:schemas-microsoft-com:office:word" xmlns:w="http://schemas.openxmlformats.org/wordprocessingml/2006/main" xmlns:w14="http://schemas.microsoft.com/office/word/2010/wordml" xmlns:w15="http://schemas.microsoft.com/office/word/2012/wordml" xmlns:w16cex="http://schemas.microsoft.com/office/word/2018/wordml/cex" xmlns:w16cid="http://schemas.microsoft.com/office/word/2016/wordml/cid" xmlns:w16="http://schemas.microsoft.com/office/word/2018/wordml" xmlns:w16sdtdh="http://schemas.microsoft.com/office/word/2020/wordml/sdtdatahash" xmlns:w16se="http://schemas.microsoft.com/office/word/2015/wordml/symex" xmlns:wpg="http://schemas.microsoft.com/office/word/2010/wordprocessingGroup" xmlns:wpi="http://schemas.microsoft.com/office/word/2010/wordprocessingInk" xmlns:wne="http://schemas.microsoft.com/office/word/2006/wordml" xmlns:wps="http://schemas.microsoft.com/office/word/2010/wordprocessingShape" mc:Ignorable="w14 w15 w16se w16cid w16 w16cex w16sdtdh wp14">
+<w:document xmlns:wpc="http://schemas.microsoft.com/office/word/2010/wordprocessingCanvas" xmlns:cx="http://schemas.microsoft.com/office/drawing/2014/chartex" xmlns:cx1="http://schemas.microsoft.com/office/drawing/2015/9/8/chartex" xmlns:cx2="http://schemas.microsoft.com/office/drawing/2015/10/21/chartex" xmlns:cx3="http://schemas.microsoft.com/office/drawing/2016/5/9/chartex" xmlns:cx4="http://schemas.microsoft.com/office/drawing/2016/5/10/chartex" xmlns:cx5="http://schemas.microsoft.com/office/drawing/2016/5/11/chartex" xmlns:cx6="http://schemas.microsoft.com/office/drawing/2016/5/12/chartex" xmlns:cx7="http://schemas.microsoft.com/office/drawing/2016/5/13/chartex" xmlns:cx8="http://schemas.microsoft.com/office/drawing/2016/5/14/chartex" xmlns:mc="http://schemas.openxmlformats.org/markup-compatibility/2006" xmlns:aink="http://schemas.microsoft.com/office/drawing/2016/ink" xmlns:am3d="http://schemas.microsoft.com/office/drawing/2017/model3d" xmlns:o="urn:schemas-microsoft-com:office:office" xmlns:oel="http://schemas.microsoft.com/office/2019/extlst" xmlns:r="http://schemas.openxmlformats.org/officeDocument/2006/relationships" xmlns:m="http://schemas.openxmlformats.org/officeDocument/2006/math" xmlns:v="urn:schemas-microsoft-com:vml" xmlns:wp14="http://schemas.microsoft.com/office/word/2010/wordprocessingDrawing" xmlns:wp="http://schemas.openxmlformats.org/drawingml/2006/wordprocessingDrawing" xmlns:w10="urn:schemas-microsoft-com:office:word" xmlns:w="http://schemas.openxmlformats.org/wordprocessingml/2006/main" xmlns:w14="http://schemas.microsoft.com/office/word/2010/wordml" xmlns:w15="http://schemas.microsoft.com/office/word/2012/wordml" xmlns:w16cex="http://schemas.microsoft.com/office/word/2018/wordml/cex" xmlns:w16cid="http://schemas.microsoft.com/office/word/2016/wordml/cid" xmlns:w16="http://schemas.microsoft.com/office/word/2018/wordml" xmlns:w16du="http://schemas.microsoft.com/office/word/2023/wordml/word16du" xmlns:w16sdtdh="http://schemas.microsoft.com/office/word/2020/wordml/sdtdatahash" xmlns:w16se="http://schemas.microsoft.com/office/word/2015/wordml/symex" xmlns:wpg="http://schemas.microsoft.com/office/word/2010/wordprocessingGroup" xmlns:wpi="http://schemas.microsoft.com/office/word/2010/wordprocessingInk" xmlns:wne="http://schemas.microsoft.com/office/word/2006/wordml" xmlns:wps="http://schemas.microsoft.com/office/word/2010/wordprocessingShape" mc:Ignorable="w14 w15 w16se w16cid w16 w16cex w16sdtdh w16du wp14">
   <w:body>
     <w:p>
       <w:pPr>
@@ -1762,7 +1762,7 @@
           <w:noProof/>
         </w:rPr>
         <w:drawing>
-          <wp:inline distT="0" distB="0" distL="0" distR="0" wp14:anchorId="08790B09" wp14:editId="5D9E1FBB">
+          <wp:inline distT="0" distB="0" distL="0" distR="0" wp14:anchorId="1368B845" wp14:editId="3371F6B3">
             <wp:extent cx="5939790" cy="1243330"/>
             <wp:effectExtent l="0" t="0" r="3810" b="1270"/>
             <wp:docPr id="1113795189" name="Рисунок 1"/>
@@ -2006,7 +2006,7 @@
         </w:rPr>
         <w:lastRenderedPageBreak/>
         <w:drawing>
-          <wp:inline distT="0" distB="0" distL="0" distR="0" wp14:anchorId="06DE2348" wp14:editId="693785CE">
+          <wp:inline distT="0" distB="0" distL="0" distR="0" wp14:anchorId="3611FD61" wp14:editId="6B324F99">
             <wp:extent cx="4302237" cy="3799527"/>
             <wp:effectExtent l="0" t="0" r="3175" b="0"/>
             <wp:docPr id="200378858" name="Рисунок 1"/>
@@ -3251,7 +3251,6 @@
         <w:rPr>
           <w:sz w:val="28"/>
           <w:szCs w:val="28"/>
-          <w:lang w:val="en-US"/>
         </w:rPr>
         <w:t>-</w:t>
       </w:r>
@@ -3276,7 +3275,15 @@
           <w:sz w:val="28"/>
           <w:szCs w:val="28"/>
         </w:rPr>
-        <w:t xml:space="preserve">: 256 </w:t>
+        <w:t xml:space="preserve">: </w:t>
+      </w:r>
+      <w:proofErr w:type="gramStart"/>
+      <w:r>
+        <w:rPr>
+          <w:sz w:val="28"/>
+          <w:szCs w:val="28"/>
+        </w:rPr>
+        <w:t xml:space="preserve">256 </w:t>
       </w:r>
       <w:r>
         <w:rPr>
@@ -3290,7 +3297,15 @@
           <w:sz w:val="28"/>
           <w:szCs w:val="28"/>
         </w:rPr>
-        <w:t xml:space="preserve"> 0;</w:t>
+        <w:t xml:space="preserve"> 0</w:t>
+      </w:r>
+      <w:proofErr w:type="gramEnd"/>
+      <w:r>
+        <w:rPr>
+          <w:sz w:val="28"/>
+          <w:szCs w:val="28"/>
+        </w:rPr>
+        <w:t>;</w:t>
       </w:r>
     </w:p>
     <w:p>
@@ -3522,6 +3537,55 @@
         </w:rPr>
         <w:t>5.23</w:t>
       </w:r>
+      <w:r>
+        <w:rPr>
+          <w:lang w:eastAsia="en-US"/>
+        </w:rPr>
+        <w:t xml:space="preserve"> </w:t>
+      </w:r>
+    </w:p>
+    <w:p>
+      <w:pPr>
+        <w:rPr>
+          <w:lang w:eastAsia="en-US"/>
+        </w:rPr>
+      </w:pPr>
+    </w:p>
+    <w:p>
+      <w:pPr>
+        <w:rPr>
+          <w:lang w:eastAsia="en-US"/>
+        </w:rPr>
+      </w:pPr>
+      <w:r>
+        <w:rPr>
+          <w:lang w:eastAsia="en-US"/>
+        </w:rPr>
+        <w:t xml:space="preserve">Ссылка на исправления в </w:t>
+      </w:r>
+      <w:proofErr w:type="spellStart"/>
+      <w:r>
+        <w:rPr>
+          <w:lang w:val="en-US" w:eastAsia="en-US"/>
+        </w:rPr>
+        <w:t>github</w:t>
+      </w:r>
+      <w:proofErr w:type="spellEnd"/>
+      <w:r>
+        <w:rPr>
+          <w:lang w:eastAsia="en-US"/>
+        </w:rPr>
+        <w:t xml:space="preserve"> репозитории: </w:t>
+      </w:r>
+      <w:hyperlink r:id="rId8" w:history="1">
+        <w:r>
+          <w:rPr>
+            <w:rStyle w:val="a3"/>
+            <w:lang w:eastAsia="en-US"/>
+          </w:rPr>
+          <w:t>https://github.com/2BuRy1/information_security_lab_2/tree/main/fix</w:t>
+        </w:r>
+      </w:hyperlink>
       <w:r>
         <w:rPr>
           <w:lang w:eastAsia="en-US"/>
@@ -3888,7 +3952,7 @@
           <w:lang w:val="en-US" w:eastAsia="en-US"/>
         </w:rPr>
         <w:drawing>
-          <wp:inline distT="0" distB="0" distL="0" distR="0" wp14:anchorId="2FEE804C" wp14:editId="51270D8E">
+          <wp:inline distT="0" distB="0" distL="0" distR="0" wp14:anchorId="042486DD" wp14:editId="08567D84">
             <wp:extent cx="4301966" cy="2083838"/>
             <wp:effectExtent l="0" t="0" r="3810" b="0"/>
             <wp:docPr id="1382442018" name="Рисунок 1"/>
@@ -3903,7 +3967,7 @@
                     <pic:cNvPicPr/>
                   </pic:nvPicPr>
                   <pic:blipFill>
-                    <a:blip r:embed="rId8"/>
+                    <a:blip r:embed="rId9"/>
                     <a:stretch>
                       <a:fillRect/>
                     </a:stretch>
@@ -3945,6 +4009,7 @@
         </w:numPr>
       </w:pPr>
       <w:r>
+        <w:lastRenderedPageBreak/>
         <w:t xml:space="preserve">Скрипт для обхода авторизации: </w:t>
       </w:r>
     </w:p>
@@ -4131,7 +4196,6 @@
         </w:numPr>
       </w:pPr>
       <w:r>
-        <w:lastRenderedPageBreak/>
         <w:t xml:space="preserve">Вывод после запуска скрипта: </w:t>
       </w:r>
     </w:p>
@@ -4147,7 +4211,7 @@
           <w:lang w:eastAsia="en-US"/>
         </w:rPr>
         <w:drawing>
-          <wp:inline distT="0" distB="0" distL="0" distR="0" wp14:anchorId="5E098D21" wp14:editId="4AE8308D">
+          <wp:inline distT="0" distB="0" distL="0" distR="0" wp14:anchorId="7919F163" wp14:editId="734E6B42">
             <wp:extent cx="5939790" cy="4737100"/>
             <wp:effectExtent l="0" t="0" r="3810" b="0"/>
             <wp:docPr id="386588635" name="Рисунок 1"/>
@@ -4162,7 +4226,7 @@
                     <pic:cNvPicPr/>
                   </pic:nvPicPr>
                   <pic:blipFill>
-                    <a:blip r:embed="rId9"/>
+                    <a:blip r:embed="rId10"/>
                     <a:stretch>
                       <a:fillRect/>
                     </a:stretch>
@@ -4608,10 +4672,11 @@
       </w:pPr>
       <w:r>
         <w:rPr>
+          <w:noProof/>
           <w:lang w:val="en-US" w:eastAsia="en-US"/>
         </w:rPr>
         <w:drawing>
-          <wp:inline distT="0" distB="0" distL="0" distR="0" wp14:anchorId="7EC89183" wp14:editId="616EEE8D">
+          <wp:inline distT="0" distB="0" distL="0" distR="0" wp14:anchorId="2275AC67" wp14:editId="1763B4C7">
             <wp:extent cx="5939790" cy="2784475"/>
             <wp:effectExtent l="0" t="0" r="3810" b="0"/>
             <wp:docPr id="2121346469" name="Рисунок 1"/>
@@ -4626,7 +4691,7 @@
                     <pic:cNvPicPr/>
                   </pic:nvPicPr>
                   <pic:blipFill>
-                    <a:blip r:embed="rId10"/>
+                    <a:blip r:embed="rId11"/>
                     <a:stretch>
                       <a:fillRect/>
                     </a:stretch>
@@ -4658,7 +4723,7 @@
 </file>
 
 <file path=word/numbering.xml><?xml version="1.0" encoding="utf-8"?>
-<w:numbering xmlns:wpc="http://schemas.microsoft.com/office/word/2010/wordprocessingCanvas" xmlns:cx="http://schemas.microsoft.com/office/drawing/2014/chartex" xmlns:cx1="http://schemas.microsoft.com/office/drawing/2015/9/8/chartex" xmlns:cx2="http://schemas.microsoft.com/office/drawing/2015/10/21/chartex" xmlns:cx3="http://schemas.microsoft.com/office/drawing/2016/5/9/chartex" xmlns:cx4="http://schemas.microsoft.com/office/drawing/2016/5/10/chartex" xmlns:cx5="http://schemas.microsoft.com/office/drawing/2016/5/11/chartex" xmlns:cx6="http://schemas.microsoft.com/office/drawing/2016/5/12/chartex" xmlns:cx7="http://schemas.microsoft.com/office/drawing/2016/5/13/chartex" xmlns:cx8="http://schemas.microsoft.com/office/drawing/2016/5/14/chartex" xmlns:mc="http://schemas.openxmlformats.org/markup-compatibility/2006" xmlns:aink="http://schemas.microsoft.com/office/drawing/2016/ink" xmlns:am3d="http://schemas.microsoft.com/office/drawing/2017/model3d" xmlns:o="urn:schemas-microsoft-com:office:office" xmlns:oel="http://schemas.microsoft.com/office/2019/extlst" xmlns:r="http://schemas.openxmlformats.org/officeDocument/2006/relationships" xmlns:m="http://schemas.openxmlformats.org/officeDocument/2006/math" xmlns:v="urn:schemas-microsoft-com:vml" xmlns:wp14="http://schemas.microsoft.com/office/word/2010/wordprocessingDrawing" xmlns:wp="http://schemas.openxmlformats.org/drawingml/2006/wordprocessingDrawing" xmlns:w10="urn:schemas-microsoft-com:office:word" xmlns:w="http://schemas.openxmlformats.org/wordprocessingml/2006/main" xmlns:w14="http://schemas.microsoft.com/office/word/2010/wordml" xmlns:w15="http://schemas.microsoft.com/office/word/2012/wordml" xmlns:w16cex="http://schemas.microsoft.com/office/word/2018/wordml/cex" xmlns:w16cid="http://schemas.microsoft.com/office/word/2016/wordml/cid" xmlns:w16="http://schemas.microsoft.com/office/word/2018/wordml" xmlns:w16sdtdh="http://schemas.microsoft.com/office/word/2020/wordml/sdtdatahash" xmlns:w16se="http://schemas.microsoft.com/office/word/2015/wordml/symex" xmlns:wpg="http://schemas.microsoft.com/office/word/2010/wordprocessingGroup" xmlns:wpi="http://schemas.microsoft.com/office/word/2010/wordprocessingInk" xmlns:wne="http://schemas.microsoft.com/office/word/2006/wordml" xmlns:wps="http://schemas.microsoft.com/office/word/2010/wordprocessingShape" mc:Ignorable="w14 w15 w16se w16cid w16 w16cex w16sdtdh wp14">
+<w:numbering xmlns:wpc="http://schemas.microsoft.com/office/word/2010/wordprocessingCanvas" xmlns:cx="http://schemas.microsoft.com/office/drawing/2014/chartex" xmlns:cx1="http://schemas.microsoft.com/office/drawing/2015/9/8/chartex" xmlns:cx2="http://schemas.microsoft.com/office/drawing/2015/10/21/chartex" xmlns:cx3="http://schemas.microsoft.com/office/drawing/2016/5/9/chartex" xmlns:cx4="http://schemas.microsoft.com/office/drawing/2016/5/10/chartex" xmlns:cx5="http://schemas.microsoft.com/office/drawing/2016/5/11/chartex" xmlns:cx6="http://schemas.microsoft.com/office/drawing/2016/5/12/chartex" xmlns:cx7="http://schemas.microsoft.com/office/drawing/2016/5/13/chartex" xmlns:cx8="http://schemas.microsoft.com/office/drawing/2016/5/14/chartex" xmlns:mc="http://schemas.openxmlformats.org/markup-compatibility/2006" xmlns:aink="http://schemas.microsoft.com/office/drawing/2016/ink" xmlns:am3d="http://schemas.microsoft.com/office/drawing/2017/model3d" xmlns:o="urn:schemas-microsoft-com:office:office" xmlns:oel="http://schemas.microsoft.com/office/2019/extlst" xmlns:r="http://schemas.openxmlformats.org/officeDocument/2006/relationships" xmlns:m="http://schemas.openxmlformats.org/officeDocument/2006/math" xmlns:v="urn:schemas-microsoft-com:vml" xmlns:wp14="http://schemas.microsoft.com/office/word/2010/wordprocessingDrawing" xmlns:wp="http://schemas.openxmlformats.org/drawingml/2006/wordprocessingDrawing" xmlns:w10="urn:schemas-microsoft-com:office:word" xmlns:w="http://schemas.openxmlformats.org/wordprocessingml/2006/main" xmlns:w14="http://schemas.microsoft.com/office/word/2010/wordml" xmlns:w15="http://schemas.microsoft.com/office/word/2012/wordml" xmlns:w16cex="http://schemas.microsoft.com/office/word/2018/wordml/cex" xmlns:w16cid="http://schemas.microsoft.com/office/word/2016/wordml/cid" xmlns:w16="http://schemas.microsoft.com/office/word/2018/wordml" xmlns:w16du="http://schemas.microsoft.com/office/word/2023/wordml/word16du" xmlns:w16sdtdh="http://schemas.microsoft.com/office/word/2020/wordml/sdtdatahash" xmlns:w16se="http://schemas.microsoft.com/office/word/2015/wordml/symex" xmlns:wpg="http://schemas.microsoft.com/office/word/2010/wordprocessingGroup" xmlns:wpi="http://schemas.microsoft.com/office/word/2010/wordprocessingInk" xmlns:wne="http://schemas.microsoft.com/office/word/2006/wordml" xmlns:wps="http://schemas.microsoft.com/office/word/2010/wordprocessingShape" mc:Ignorable="w14 w15 w16se w16cid w16 w16cex w16sdtdh w16du wp14">
   <w:abstractNum w:abstractNumId="0" w15:restartNumberingAfterBreak="0">
     <w:nsid w:val="05E01C43"/>
     <w:multiLevelType w:val="hybridMultilevel"/>
@@ -5192,7 +5257,7 @@
 </file>
 
 <file path=word/styles.xml><?xml version="1.0" encoding="utf-8"?>
-<w:styles xmlns:mc="http://schemas.openxmlformats.org/markup-compatibility/2006" xmlns:r="http://schemas.openxmlformats.org/officeDocument/2006/relationships" xmlns:w="http://schemas.openxmlformats.org/wordprocessingml/2006/main" xmlns:w14="http://schemas.microsoft.com/office/word/2010/wordml" xmlns:w15="http://schemas.microsoft.com/office/word/2012/wordml" xmlns:w16cex="http://schemas.microsoft.com/office/word/2018/wordml/cex" xmlns:w16cid="http://schemas.microsoft.com/office/word/2016/wordml/cid" xmlns:w16="http://schemas.microsoft.com/office/word/2018/wordml" xmlns:w16sdtdh="http://schemas.microsoft.com/office/word/2020/wordml/sdtdatahash" xmlns:w16se="http://schemas.microsoft.com/office/word/2015/wordml/symex" mc:Ignorable="w14 w15 w16se w16cid w16 w16cex w16sdtdh">
+<w:styles xmlns:mc="http://schemas.openxmlformats.org/markup-compatibility/2006" xmlns:r="http://schemas.openxmlformats.org/officeDocument/2006/relationships" xmlns:w="http://schemas.openxmlformats.org/wordprocessingml/2006/main" xmlns:w14="http://schemas.microsoft.com/office/word/2010/wordml" xmlns:w15="http://schemas.microsoft.com/office/word/2012/wordml" xmlns:w16cex="http://schemas.microsoft.com/office/word/2018/wordml/cex" xmlns:w16cid="http://schemas.microsoft.com/office/word/2016/wordml/cid" xmlns:w16="http://schemas.microsoft.com/office/word/2018/wordml" xmlns:w16du="http://schemas.microsoft.com/office/word/2023/wordml/word16du" xmlns:w16sdtdh="http://schemas.microsoft.com/office/word/2020/wordml/sdtdatahash" xmlns:w16se="http://schemas.microsoft.com/office/word/2015/wordml/symex" mc:Ignorable="w14 w15 w16se w16cid w16 w16cex w16sdtdh w16du">
   <w:docDefaults>
     <w:rPrDefault>
       <w:rPr>

</xml_diff>